<commit_message>
Globe portfolio: work and projects on one globe
</commit_message>
<xml_diff>
--- a/Naresh_Valavala_Resume.docx
+++ b/Naresh_Valavala_Resume.docx
@@ -27,7 +27,7 @@
           <w:i w:val="0"/>
           <w:sz w:val="22"/>
         </w:rPr>
-        <w:t>Technical Lead | CCM Solutions Architect | P&amp;C Insurance</w:t>
+        <w:t>Technical Product Lead | Legacy Modernization | P&amp;C Insurance</w:t>
       </w:r>
     </w:p>
     <w:p>
@@ -66,7 +66,7 @@
           <w:b w:val="0"/>
           <w:i w:val="0"/>
         </w:rPr>
-        <w:t>Technical Lead with 20+ years leading CCM and output solutions for insurers, modernizing P&amp;C insurance systems, from mainframe COBOL, JCL and Ratabase to a decade building on OpenText Exstream, now leading the OpenText team for the new General Liability product at Everest. Led architecture and delivery at Hanover, Erie and Everest across onshore and offshore teams, business analysts, product owners and business partners. Designing and building AI applications independently: prompt-engineered LLM pipelines, workflow orchestration and speech/audio ML. ServiceNow Certified System Administrator (2026) and AWS Certified AI Practitioner (2025). Highly motivated and driven, seeking Lead and Architect roles, including at startups.</w:t>
+        <w:t>Technical Product Lead with 20 years modernizing P&amp;C insurance systems, from mainframe COBOL, JCL and Ratabase to a decade building on OpenText Exstream, now leading a General Liability redesign onto Guidewire PolicyCenter at Everest. Led architecture and delivery at Hanover, Erie and Everest across onshore and offshore teams, business analysts, product owners and business partners. Designing and building AI applications independently: prompt-engineered LLM pipelines, workflow orchestration and speech/audio ML. ServiceNow Certified System Administrator (2026) and AWS Certified AI Practitioner (2025). Seeking Lead and Architect roles.</w:t>
       </w:r>
     </w:p>
     <w:p>
@@ -245,7 +245,7 @@
         <w:spacing w:after="20"/>
       </w:pPr>
       <w:r>
-        <w:t>Lead the OpenText team (5 to 6) delivering the document layer for the new General Liability product, integrated with Guidewire PolicyCenter, with documents in OpenText Exstream 25.3 Cloud Native on Azure; about 2,000 forms in scope.</w:t>
+        <w:t>Lead a team of 5 to 6 delivering OpenText work to redesign General Liability, a new product, onto Guidewire PolicyCenter, with documents in OpenText Exstream 25.3 Cloud Native on Azure; about 2,000 forms redesigned, first production release shipped, now on release 1.5.</w:t>
       </w:r>
     </w:p>
     <w:p>
@@ -733,15 +733,6 @@
         <w:spacing w:after="20"/>
       </w:pPr>
       <w:r>
-        <w:t>Claude Certified Architect: Foundations, Anthropic, 2026</w:t>
-      </w:r>
-    </w:p>
-    <w:p>
-      <w:pPr>
-        <w:pStyle w:val="ListBullet"/>
-        <w:spacing w:after="20"/>
-      </w:pPr>
-      <w:r>
         <w:t>ServiceNow Certified System Administrator (CSA), ServiceNow, 2026</w:t>
       </w:r>
     </w:p>

</xml_diff>